<commit_message>
Added new project Muddy Corals and updated new resume
</commit_message>
<xml_diff>
--- a/Resume.docx
+++ b/Resume.docx
@@ -185,6 +185,7 @@
           <w:between w:val="nil"/>
         </w:pBdr>
         <w:spacing w:line="252" w:lineRule="auto"/>
+        <w:jc w:val="both"/>
         <w:rPr>
           <w:rFonts w:ascii="Garamond" w:eastAsia="Garamond" w:hAnsi="Garamond" w:cs="Garamond"/>
           <w:bCs/>
@@ -202,6 +203,118 @@
           <w:rFonts w:ascii="Garamond" w:eastAsia="Garamond" w:hAnsi="Garamond" w:cs="Garamond"/>
         </w:rPr>
         <w:t xml:space="preserve"> </w:t>
+      </w:r>
+      <w:r>
+        <w:rPr>
+          <w:rFonts w:ascii="Garamond" w:eastAsia="Garamond" w:hAnsi="Garamond" w:cs="Garamond"/>
+          <w:bCs/>
+          <w:color w:val="000000"/>
+        </w:rPr>
+        <w:t>experience</w:t>
+      </w:r>
+      <w:r>
+        <w:rPr>
+          <w:rFonts w:ascii="Garamond" w:eastAsia="Garamond" w:hAnsi="Garamond" w:cs="Garamond"/>
+          <w:bCs/>
+          <w:color w:val="000000"/>
+        </w:rPr>
+        <w:t>d</w:t>
+      </w:r>
+      <w:r>
+        <w:rPr>
+          <w:rFonts w:ascii="Garamond" w:eastAsia="Garamond" w:hAnsi="Garamond" w:cs="Garamond"/>
+          <w:bCs/>
+          <w:color w:val="000000"/>
+        </w:rPr>
+        <w:t xml:space="preserve"> </w:t>
+      </w:r>
+      <w:r>
+        <w:rPr>
+          <w:rFonts w:ascii="Garamond" w:eastAsia="Garamond" w:hAnsi="Garamond" w:cs="Garamond"/>
+          <w:bCs/>
+          <w:color w:val="000000"/>
+        </w:rPr>
+        <w:t xml:space="preserve">in </w:t>
+      </w:r>
+      <w:r>
+        <w:rPr>
+          <w:rFonts w:ascii="Garamond" w:eastAsia="Garamond" w:hAnsi="Garamond" w:cs="Garamond"/>
+          <w:bCs/>
+          <w:color w:val="000000"/>
+        </w:rPr>
+        <w:t>designing and building</w:t>
+      </w:r>
+      <w:r>
+        <w:rPr>
+          <w:rFonts w:ascii="Garamond" w:eastAsia="Garamond" w:hAnsi="Garamond" w:cs="Garamond"/>
+          <w:bCs/>
+          <w:color w:val="000000"/>
+        </w:rPr>
+        <w:t xml:space="preserve"> digital platforms and</w:t>
+      </w:r>
+      <w:r>
+        <w:rPr>
+          <w:rFonts w:ascii="Garamond" w:eastAsia="Garamond" w:hAnsi="Garamond" w:cs="Garamond"/>
+          <w:bCs/>
+          <w:color w:val="000000"/>
+        </w:rPr>
+        <w:t xml:space="preserve"> interactive systems across web, physical and immersive environments. My work combines </w:t>
+      </w:r>
+      <w:r>
+        <w:rPr>
+          <w:rFonts w:ascii="Garamond" w:eastAsia="Garamond" w:hAnsi="Garamond" w:cs="Garamond"/>
+          <w:bCs/>
+          <w:color w:val="000000"/>
+        </w:rPr>
+        <w:t>interaction design</w:t>
+      </w:r>
+      <w:r>
+        <w:rPr>
+          <w:rFonts w:ascii="Garamond" w:eastAsia="Garamond" w:hAnsi="Garamond" w:cs="Garamond"/>
+          <w:bCs/>
+          <w:color w:val="000000"/>
+        </w:rPr>
+        <w:t xml:space="preserve">, </w:t>
+      </w:r>
+      <w:r>
+        <w:rPr>
+          <w:rFonts w:ascii="Garamond" w:eastAsia="Garamond" w:hAnsi="Garamond" w:cs="Garamond"/>
+          <w:bCs/>
+          <w:color w:val="000000"/>
+        </w:rPr>
+        <w:t>storytelling</w:t>
+      </w:r>
+      <w:r>
+        <w:rPr>
+          <w:rFonts w:ascii="Garamond" w:eastAsia="Garamond" w:hAnsi="Garamond" w:cs="Garamond"/>
+          <w:bCs/>
+          <w:color w:val="000000"/>
+        </w:rPr>
+        <w:t xml:space="preserve"> and </w:t>
+      </w:r>
+      <w:r>
+        <w:rPr>
+          <w:rFonts w:ascii="Garamond" w:eastAsia="Garamond" w:hAnsi="Garamond" w:cs="Garamond"/>
+          <w:bCs/>
+          <w:color w:val="000000"/>
+        </w:rPr>
+        <w:t>creative coding</w:t>
+      </w:r>
+      <w:r>
+        <w:rPr>
+          <w:rFonts w:ascii="Garamond" w:eastAsia="Garamond" w:hAnsi="Garamond" w:cs="Garamond"/>
+          <w:bCs/>
+          <w:color w:val="000000"/>
+        </w:rPr>
+        <w:t xml:space="preserve"> </w:t>
+      </w:r>
+      <w:r>
+        <w:rPr>
+          <w:rFonts w:ascii="Garamond" w:eastAsia="Garamond" w:hAnsi="Garamond" w:cs="Garamond"/>
+          <w:bCs/>
+          <w:color w:val="000000"/>
+        </w:rPr>
+        <w:t>to create engaging digital experiences. Comfortable working across the full process from prototyping and experimentation through to implementation, with a strong focus on craft, performance and technical problem-solving</w:t>
       </w:r>
       <w:r>
         <w:rPr>
@@ -209,79 +322,7 @@
           <w:bCs/>
           <w:color w:val="000000"/>
         </w:rPr>
-        <w:t xml:space="preserve">with </w:t>
-      </w:r>
-      <w:r>
-        <w:rPr>
-          <w:rFonts w:ascii="Garamond" w:eastAsia="Garamond" w:hAnsi="Garamond" w:cs="Garamond"/>
-          <w:bCs/>
-          <w:color w:val="000000"/>
-        </w:rPr>
-        <w:t>3</w:t>
-      </w:r>
-      <w:r>
-        <w:rPr>
-          <w:rFonts w:ascii="Garamond" w:eastAsia="Garamond" w:hAnsi="Garamond" w:cs="Garamond" w:hint="eastAsia"/>
-          <w:bCs/>
-          <w:color w:val="000000"/>
-        </w:rPr>
-        <w:t xml:space="preserve"> years of experience delivering digital platforms and interactive environments across product and </w:t>
-      </w:r>
-      <w:r>
-        <w:rPr>
-          <w:rFonts w:ascii="Garamond" w:eastAsia="Garamond" w:hAnsi="Garamond" w:cs="Garamond"/>
-          <w:bCs/>
-          <w:color w:val="000000"/>
-        </w:rPr>
-        <w:t>brand</w:t>
-      </w:r>
-      <w:r>
-        <w:rPr>
-          <w:rFonts w:ascii="Garamond" w:eastAsia="Garamond" w:hAnsi="Garamond" w:cs="Garamond" w:hint="eastAsia"/>
-          <w:bCs/>
-          <w:color w:val="000000"/>
-        </w:rPr>
-        <w:t xml:space="preserve"> contexts. Managed platform redesigns and design system development, translating insights into scalable, </w:t>
-      </w:r>
-      <w:r>
-        <w:rPr>
-          <w:rFonts w:ascii="Garamond" w:eastAsia="Garamond" w:hAnsi="Garamond" w:cs="Garamond"/>
-          <w:bCs/>
-          <w:color w:val="000000"/>
-        </w:rPr>
-        <w:t>accessible</w:t>
-      </w:r>
-      <w:r>
-        <w:rPr>
-          <w:rFonts w:ascii="Garamond" w:eastAsia="Garamond" w:hAnsi="Garamond" w:cs="Garamond"/>
-          <w:bCs/>
-          <w:color w:val="000000"/>
-        </w:rPr>
-        <w:t xml:space="preserve"> cross-channel</w:t>
-      </w:r>
-      <w:r>
-        <w:rPr>
-          <w:rFonts w:ascii="Garamond" w:eastAsia="Garamond" w:hAnsi="Garamond" w:cs="Garamond" w:hint="eastAsia"/>
-          <w:bCs/>
-          <w:color w:val="000000"/>
-        </w:rPr>
-        <w:t xml:space="preserve"> solutions. Detail-oriented, system-thinking and user-</w:t>
-      </w:r>
-      <w:r>
-        <w:rPr>
-          <w:rFonts w:ascii="Garamond" w:eastAsia="Garamond" w:hAnsi="Garamond" w:cs="Garamond"/>
-          <w:bCs/>
-          <w:color w:val="000000"/>
-        </w:rPr>
-        <w:t>obsessed</w:t>
-      </w:r>
-      <w:r>
-        <w:rPr>
-          <w:rFonts w:ascii="Garamond" w:eastAsia="Garamond" w:hAnsi="Garamond" w:cs="Garamond" w:hint="eastAsia"/>
-          <w:bCs/>
-          <w:color w:val="000000"/>
-        </w:rPr>
-        <w:t>, with a structured approach to problem framing, iteration and cross-functional collaboration.</w:t>
+        <w:t>.</w:t>
       </w:r>
     </w:p>
     <w:p>
@@ -355,6 +396,7 @@
           <w:tab w:val="left" w:pos="1134"/>
           <w:tab w:val="right" w:pos="10773"/>
         </w:tabs>
+        <w:jc w:val="both"/>
         <w:rPr>
           <w:rFonts w:ascii="Garamond" w:eastAsia="Garamond" w:hAnsi="Garamond" w:cs="Garamond"/>
           <w:b/>
@@ -402,6 +444,7 @@
           <w:tab w:val="left" w:pos="1134"/>
           <w:tab w:val="right" w:pos="10773"/>
         </w:tabs>
+        <w:jc w:val="both"/>
         <w:rPr>
           <w:rFonts w:ascii="Garamond" w:eastAsia="Garamond" w:hAnsi="Garamond" w:cs="Garamond"/>
         </w:rPr>
@@ -453,6 +496,7 @@
         </w:pBdr>
         <w:spacing w:line="252" w:lineRule="auto"/>
         <w:ind w:left="284" w:hanging="284"/>
+        <w:jc w:val="both"/>
         <w:rPr>
           <w:rFonts w:ascii="Garamond" w:hAnsi="Garamond"/>
           <w:color w:val="000000"/>
@@ -492,6 +536,7 @@
           <w:ilvl w:val="0"/>
           <w:numId w:val="11"/>
         </w:numPr>
+        <w:jc w:val="both"/>
         <w:rPr>
           <w:rFonts w:ascii="Garamond" w:eastAsia="Garamond" w:hAnsi="Garamond" w:cs="Garamond"/>
         </w:rPr>
@@ -524,9 +569,9 @@
           <w:ilvl w:val="0"/>
           <w:numId w:val="11"/>
         </w:numPr>
-        <w:rPr>
-          <w:rFonts w:ascii="Garamond" w:hAnsi="Garamond"/>
-          <w:color w:val="000000"/>
+        <w:jc w:val="both"/>
+        <w:rPr>
+          <w:rFonts w:ascii="Garamond" w:eastAsia="Garamond" w:hAnsi="Garamond" w:cs="Garamond"/>
         </w:rPr>
       </w:pPr>
       <w:r>
@@ -541,31 +586,32 @@
         <w:rPr>
           <w:rFonts w:ascii="Garamond" w:eastAsia="Garamond" w:hAnsi="Garamond" w:cs="Garamond"/>
         </w:rPr>
-        <w:t xml:space="preserve">Produced </w:t>
-      </w:r>
-      <w:r>
-        <w:rPr>
-          <w:rFonts w:ascii="Garamond" w:eastAsia="Garamond" w:hAnsi="Garamond" w:cs="Garamond"/>
-        </w:rPr>
-        <w:t>structured documentation</w:t>
-      </w:r>
-      <w:r>
-        <w:rPr>
-          <w:rFonts w:ascii="Garamond" w:eastAsia="Garamond" w:hAnsi="Garamond" w:cs="Garamond"/>
-        </w:rPr>
-        <w:t xml:space="preserve">, issue reports and </w:t>
-      </w:r>
-      <w:r>
-        <w:rPr>
-          <w:rFonts w:ascii="Garamond" w:eastAsia="Garamond" w:hAnsi="Garamond" w:cs="Garamond"/>
-        </w:rPr>
-        <w:t>testing feedback</w:t>
-      </w:r>
-      <w:r>
-        <w:rPr>
-          <w:rFonts w:ascii="Garamond" w:eastAsia="Garamond" w:hAnsi="Garamond" w:cs="Garamond"/>
-        </w:rPr>
-        <w:t xml:space="preserve"> within a Git-based open-source workflow, partnering with developers to implement scalable, maintainable fixed regression risk in subsequent releases.</w:t>
+        <w:t xml:space="preserve">Produced structured documentation, issue reports and </w:t>
+      </w:r>
+    </w:p>
+    <w:p>
+      <w:pPr>
+        <w:pStyle w:val="ListParagraph"/>
+        <w:numPr>
+          <w:ilvl w:val="0"/>
+          <w:numId w:val="11"/>
+        </w:numPr>
+        <w:jc w:val="both"/>
+        <w:rPr>
+          <w:rFonts w:ascii="Garamond" w:eastAsia="Garamond" w:hAnsi="Garamond" w:cs="Garamond"/>
+        </w:rPr>
+      </w:pPr>
+      <w:r>
+        <w:rPr>
+          <w:rFonts w:ascii="Garamond" w:eastAsia="Garamond" w:hAnsi="Garamond" w:cs="Garamond"/>
+        </w:rPr>
+        <w:t>testing feedback within a Git-based workflow, supporting maintainable fixes and reducing regression risk</w:t>
+      </w:r>
+      <w:r>
+        <w:rPr>
+          <w:rFonts w:ascii="Garamond" w:eastAsia="Garamond" w:hAnsi="Garamond" w:cs="Garamond"/>
+        </w:rPr>
+        <w:t>.</w:t>
       </w:r>
     </w:p>
     <w:p>
@@ -574,6 +620,7 @@
           <w:tab w:val="left" w:pos="1134"/>
           <w:tab w:val="right" w:pos="10773"/>
         </w:tabs>
+        <w:jc w:val="both"/>
         <w:rPr>
           <w:rFonts w:ascii="Garamond" w:eastAsia="Garamond" w:hAnsi="Garamond" w:cs="Garamond"/>
           <w:b/>
@@ -586,6 +633,7 @@
           <w:tab w:val="left" w:pos="1134"/>
           <w:tab w:val="right" w:pos="10773"/>
         </w:tabs>
+        <w:jc w:val="both"/>
         <w:rPr>
           <w:rFonts w:ascii="Garamond" w:eastAsia="Garamond" w:hAnsi="Garamond" w:cs="Garamond"/>
           <w:b/>
@@ -620,6 +668,7 @@
           <w:tab w:val="left" w:pos="1134"/>
           <w:tab w:val="right" w:pos="10773"/>
         </w:tabs>
+        <w:jc w:val="both"/>
         <w:rPr>
           <w:rFonts w:ascii="Garamond" w:eastAsia="Garamond" w:hAnsi="Garamond" w:cs="Garamond"/>
         </w:rPr>
@@ -650,6 +699,7 @@
           <w:tab w:val="left" w:pos="1134"/>
           <w:tab w:val="right" w:pos="10773"/>
         </w:tabs>
+        <w:jc w:val="both"/>
         <w:rPr>
           <w:rFonts w:ascii="Garamond" w:eastAsia="Garamond" w:hAnsi="Garamond" w:cs="Garamond"/>
         </w:rPr>
@@ -751,6 +801,7 @@
         </w:pBdr>
         <w:spacing w:line="252" w:lineRule="auto"/>
         <w:ind w:left="284" w:hanging="284"/>
+        <w:jc w:val="both"/>
         <w:rPr>
           <w:rFonts w:ascii="Garamond" w:hAnsi="Garamond"/>
           <w:color w:val="000000"/>
@@ -785,6 +836,7 @@
           <w:ilvl w:val="0"/>
           <w:numId w:val="11"/>
         </w:numPr>
+        <w:jc w:val="both"/>
         <w:rPr>
           <w:rFonts w:ascii="Garamond" w:hAnsi="Garamond"/>
           <w:color w:val="000000"/>
@@ -797,21 +849,16 @@
           <w:bCs/>
           <w:color w:val="000000"/>
         </w:rPr>
-        <w:t>New Business:</w:t>
-      </w:r>
-      <w:r>
-        <w:rPr>
-          <w:rFonts w:ascii="Garamond" w:hAnsi="Garamond"/>
-          <w:color w:val="000000"/>
-        </w:rPr>
-        <w:t xml:space="preserve"> Built pitch decks </w:t>
-      </w:r>
-      <w:r>
-        <w:rPr>
-          <w:rFonts w:ascii="Garamond" w:hAnsi="Garamond"/>
-          <w:color w:val="000000"/>
-        </w:rPr>
-        <w:t>that secured</w:t>
+        <w:t>Multi-Sensory Brand Storytelling</w:t>
+      </w:r>
+      <w:r>
+        <w:rPr>
+          <w:rFonts w:ascii="Garamond" w:hAnsi="Garamond"/>
+          <w:b/>
+          <w:bCs/>
+          <w:color w:val="000000"/>
+        </w:rPr>
+        <w:t>:</w:t>
       </w:r>
       <w:r>
         <w:rPr>
@@ -825,57 +872,7 @@
           <w:rFonts w:ascii="Garamond" w:hAnsi="Garamond"/>
           <w:color w:val="000000"/>
         </w:rPr>
-        <w:t xml:space="preserve">Starbucks as </w:t>
-      </w:r>
-      <w:r>
-        <w:rPr>
-          <w:rFonts w:ascii="Garamond" w:hAnsi="Garamond"/>
-          <w:color w:val="000000"/>
-        </w:rPr>
-        <w:t>a new major client</w:t>
-      </w:r>
-      <w:r>
-        <w:rPr>
-          <w:rFonts w:ascii="Garamond" w:hAnsi="Garamond"/>
-          <w:color w:val="000000"/>
-        </w:rPr>
-        <w:t>, aligning experiential concepts with regional brand priorities and business objectives.</w:t>
-      </w:r>
-    </w:p>
-    <w:p>
-      <w:pPr>
-        <w:pStyle w:val="ListParagraph"/>
-        <w:numPr>
-          <w:ilvl w:val="0"/>
-          <w:numId w:val="11"/>
-        </w:numPr>
-        <w:rPr>
-          <w:rFonts w:ascii="Garamond" w:hAnsi="Garamond"/>
-          <w:color w:val="000000"/>
-        </w:rPr>
-      </w:pPr>
-      <w:r>
-        <w:rPr>
-          <w:rFonts w:ascii="Garamond" w:hAnsi="Garamond"/>
-          <w:b/>
-          <w:bCs/>
-          <w:color w:val="000000"/>
-        </w:rPr>
-        <w:t>Brand Translation:</w:t>
-      </w:r>
-      <w:r>
-        <w:rPr>
-          <w:rFonts w:ascii="Garamond" w:hAnsi="Garamond"/>
-          <w:color w:val="000000"/>
-        </w:rPr>
-        <w:t xml:space="preserve"> </w:t>
-      </w:r>
-      <w:r>
-        <w:rPr>
-          <w:rFonts w:ascii="Garamond" w:hAnsi="Garamond"/>
-          <w:color w:val="000000"/>
-        </w:rPr>
-        <w:t>Translated Starbucks’ regional heritage into multi-sensory experience blending scent, visual, and touch, achieving 83% visitor satisfaction (excellent/very good) and 73% uplift in brand and product understanding. This project won Bronze Drum Award for Best Experiential</w:t>
+        <w:t>Developed the project from the initial client pitch through to delivery, combining motion, graphics, scent and physical interaction into one multi-sensory experience. Achieved 83% visitor satisfaction and a 73% increase in brand understanding. Awarded Bronze Drum for Best Experiential</w:t>
       </w:r>
       <w:r>
         <w:rPr>
@@ -901,6 +898,7 @@
         </w:pBdr>
         <w:spacing w:line="252" w:lineRule="auto"/>
         <w:ind w:left="284" w:hanging="284"/>
+        <w:jc w:val="both"/>
         <w:rPr>
           <w:rFonts w:ascii="Garamond" w:hAnsi="Garamond"/>
           <w:color w:val="000000"/>
@@ -936,6 +934,7 @@
           <w:ilvl w:val="0"/>
           <w:numId w:val="10"/>
         </w:numPr>
+        <w:jc w:val="both"/>
         <w:rPr>
           <w:rFonts w:ascii="Garamond" w:hAnsi="Garamond"/>
           <w:color w:val="000000"/>
@@ -948,7 +947,7 @@
           <w:bCs/>
           <w:color w:val="000000"/>
         </w:rPr>
-        <w:t>Gamified Learning</w:t>
+        <w:t>Gamified Learning Experience</w:t>
       </w:r>
       <w:r>
         <w:rPr>
@@ -957,7 +956,7 @@
           <w:bCs/>
           <w:color w:val="000000"/>
         </w:rPr>
-        <w:t xml:space="preserve"> System:</w:t>
+        <w:t>:</w:t>
       </w:r>
       <w:r>
         <w:rPr>
@@ -971,21 +970,7 @@
           <w:rFonts w:ascii="Garamond" w:hAnsi="Garamond"/>
           <w:color w:val="000000"/>
         </w:rPr>
-        <w:t>Led gamified AR learning experience highlighting Cisco’s latest innovations</w:t>
-      </w:r>
-      <w:r>
-        <w:rPr>
-          <w:rFonts w:ascii="Garamond" w:hAnsi="Garamond"/>
-          <w:color w:val="000000"/>
-        </w:rPr>
-        <w:t xml:space="preserve"> </w:t>
-      </w:r>
-      <w:r>
-        <w:rPr>
-          <w:rFonts w:ascii="Garamond" w:hAnsi="Garamond"/>
-          <w:color w:val="000000"/>
-        </w:rPr>
-        <w:t>and strategic partnerships, improving engagement and product understanding</w:t>
+        <w:t>Designed and implemented a gamified AR learning system, exploring innovative technology and interaction logics to improve engagement and knowledge delivery</w:t>
       </w:r>
       <w:r>
         <w:rPr>
@@ -1017,6 +1002,7 @@
           <w:ilvl w:val="0"/>
           <w:numId w:val="10"/>
         </w:numPr>
+        <w:jc w:val="both"/>
         <w:rPr>
           <w:rFonts w:ascii="Garamond" w:hAnsi="Garamond"/>
           <w:color w:val="000000"/>
@@ -1043,14 +1029,235 @@
           <w:rFonts w:ascii="Garamond" w:hAnsi="Garamond"/>
           <w:color w:val="000000"/>
         </w:rPr>
-        <w:t xml:space="preserve">Redesigned internal content systems by migrating static documentation into </w:t>
-      </w:r>
-      <w:r>
-        <w:rPr>
-          <w:rFonts w:ascii="Garamond" w:hAnsi="Garamond"/>
-          <w:color w:val="000000"/>
-        </w:rPr>
-        <w:t>a scalable WordPress CMS architecture.</w:t>
+        <w:t>Redesigned Cisco's internal CMS platform around content and publishing workflows. Restructured information architecture and reusable templates to improve discoverability and maintainability</w:t>
+      </w:r>
+      <w:r>
+        <w:rPr>
+          <w:rFonts w:ascii="Garamond" w:hAnsi="Garamond"/>
+          <w:color w:val="000000"/>
+        </w:rPr>
+        <w:t>.</w:t>
+      </w:r>
+    </w:p>
+    <w:p>
+      <w:pPr>
+        <w:widowControl w:val="0"/>
+        <w:jc w:val="both"/>
+        <w:rPr>
+          <w:rFonts w:ascii="Garamond" w:hAnsi="Garamond"/>
+          <w:color w:val="000000"/>
+        </w:rPr>
+      </w:pPr>
+      <w:proofErr w:type="gramStart"/>
+      <w:r>
+        <w:rPr>
+          <w:rFonts w:ascii="Garamond" w:hAnsi="Garamond"/>
+          <w:color w:val="000000"/>
+        </w:rPr>
+        <w:t>●</w:t>
+      </w:r>
+      <w:r>
+        <w:rPr>
+          <w:rFonts w:ascii="Garamond" w:hAnsi="Garamond"/>
+          <w:color w:val="000000"/>
+        </w:rPr>
+        <w:t xml:space="preserve">  GPJ</w:t>
+      </w:r>
+      <w:proofErr w:type="gramEnd"/>
+      <w:r>
+        <w:rPr>
+          <w:rFonts w:ascii="Garamond" w:hAnsi="Garamond"/>
+          <w:color w:val="000000"/>
+        </w:rPr>
+        <w:t xml:space="preserve"> Lab</w:t>
+      </w:r>
+      <w:r>
+        <w:rPr>
+          <w:rFonts w:ascii="Garamond" w:hAnsi="Garamond"/>
+          <w:color w:val="000000"/>
+        </w:rPr>
+        <w:t xml:space="preserve">                                                                                                                                       United Kingdom</w:t>
+      </w:r>
+    </w:p>
+    <w:p>
+      <w:pPr>
+        <w:pStyle w:val="ListParagraph"/>
+        <w:numPr>
+          <w:ilvl w:val="0"/>
+          <w:numId w:val="10"/>
+        </w:numPr>
+        <w:jc w:val="both"/>
+        <w:rPr>
+          <w:rFonts w:ascii="Garamond" w:hAnsi="Garamond"/>
+          <w:color w:val="000000"/>
+        </w:rPr>
+      </w:pPr>
+      <w:r>
+        <w:rPr>
+          <w:rFonts w:ascii="Garamond" w:hAnsi="Garamond"/>
+          <w:b/>
+          <w:bCs/>
+          <w:color w:val="000000"/>
+        </w:rPr>
+        <w:t>Spatial Computing</w:t>
+      </w:r>
+      <w:r>
+        <w:rPr>
+          <w:rFonts w:ascii="Garamond" w:hAnsi="Garamond"/>
+          <w:b/>
+          <w:bCs/>
+          <w:color w:val="000000"/>
+        </w:rPr>
+        <w:t>:</w:t>
+      </w:r>
+      <w:r>
+        <w:rPr>
+          <w:rFonts w:ascii="Garamond" w:hAnsi="Garamond"/>
+          <w:color w:val="000000"/>
+        </w:rPr>
+        <w:t xml:space="preserve"> Designed and b</w:t>
+      </w:r>
+      <w:r>
+        <w:rPr>
+          <w:rFonts w:ascii="Garamond" w:hAnsi="Garamond"/>
+          <w:color w:val="000000"/>
+        </w:rPr>
+        <w:t xml:space="preserve">uilt an </w:t>
+      </w:r>
+      <w:r>
+        <w:rPr>
+          <w:rFonts w:ascii="Garamond" w:hAnsi="Garamond"/>
+          <w:color w:val="000000"/>
+        </w:rPr>
+        <w:t>X</w:t>
+      </w:r>
+      <w:r>
+        <w:rPr>
+          <w:rFonts w:ascii="Garamond" w:hAnsi="Garamond"/>
+          <w:color w:val="000000"/>
+        </w:rPr>
+        <w:t xml:space="preserve">R application for Vision Pro using </w:t>
+      </w:r>
+      <w:proofErr w:type="spellStart"/>
+      <w:r>
+        <w:rPr>
+          <w:rFonts w:ascii="Garamond" w:hAnsi="Garamond"/>
+          <w:color w:val="000000"/>
+        </w:rPr>
+        <w:t>RealityKit</w:t>
+      </w:r>
+      <w:proofErr w:type="spellEnd"/>
+      <w:r>
+        <w:rPr>
+          <w:rFonts w:ascii="Garamond" w:hAnsi="Garamond"/>
+          <w:color w:val="000000"/>
+        </w:rPr>
+        <w:t xml:space="preserve">, </w:t>
+      </w:r>
+      <w:r>
+        <w:rPr>
+          <w:rFonts w:ascii="Garamond" w:hAnsi="Garamond"/>
+          <w:color w:val="000000"/>
+        </w:rPr>
+        <w:t>exploring spatial interaction, real-time rendering and embodied storytelling through responsive mixed-reality environments</w:t>
+      </w:r>
+      <w:r>
+        <w:rPr>
+          <w:rFonts w:ascii="Garamond" w:hAnsi="Garamond"/>
+          <w:color w:val="000000"/>
+        </w:rPr>
+        <w:t>.</w:t>
+      </w:r>
+    </w:p>
+    <w:p>
+      <w:pPr>
+        <w:pStyle w:val="ListParagraph"/>
+        <w:widowControl w:val="0"/>
+        <w:numPr>
+          <w:ilvl w:val="0"/>
+          <w:numId w:val="10"/>
+        </w:numPr>
+        <w:jc w:val="both"/>
+        <w:rPr>
+          <w:rFonts w:ascii="Garamond" w:hAnsi="Garamond"/>
+          <w:color w:val="000000"/>
+        </w:rPr>
+      </w:pPr>
+      <w:r>
+        <w:rPr>
+          <w:rFonts w:ascii="Garamond" w:hAnsi="Garamond"/>
+          <w:b/>
+          <w:bCs/>
+          <w:color w:val="000000"/>
+        </w:rPr>
+        <w:t xml:space="preserve">Innovation </w:t>
+      </w:r>
+      <w:r>
+        <w:rPr>
+          <w:rFonts w:ascii="Garamond" w:hAnsi="Garamond"/>
+          <w:b/>
+          <w:bCs/>
+          <w:color w:val="000000"/>
+        </w:rPr>
+        <w:t>R&amp;D</w:t>
+      </w:r>
+      <w:r>
+        <w:rPr>
+          <w:rFonts w:ascii="Garamond" w:hAnsi="Garamond"/>
+          <w:b/>
+          <w:bCs/>
+          <w:color w:val="000000"/>
+        </w:rPr>
+        <w:t>:</w:t>
+      </w:r>
+      <w:r>
+        <w:rPr>
+          <w:rFonts w:ascii="Garamond" w:hAnsi="Garamond"/>
+          <w:color w:val="000000"/>
+        </w:rPr>
+        <w:t xml:space="preserve"> Experimented with</w:t>
+      </w:r>
+      <w:r>
+        <w:rPr>
+          <w:rFonts w:ascii="Garamond" w:hAnsi="Garamond"/>
+          <w:color w:val="000000"/>
+        </w:rPr>
+        <w:t xml:space="preserve"> Gen-AI, AR/VR and </w:t>
+      </w:r>
+      <w:r>
+        <w:rPr>
+          <w:rFonts w:ascii="Garamond" w:hAnsi="Garamond"/>
+          <w:color w:val="000000"/>
+        </w:rPr>
+        <w:t>emerging</w:t>
+      </w:r>
+      <w:r>
+        <w:rPr>
+          <w:rFonts w:ascii="Garamond" w:hAnsi="Garamond"/>
+          <w:color w:val="000000"/>
+        </w:rPr>
+        <w:t xml:space="preserve"> technologies,</w:t>
+      </w:r>
+      <w:r>
+        <w:rPr>
+          <w:rFonts w:ascii="Garamond" w:hAnsi="Garamond"/>
+          <w:color w:val="000000"/>
+        </w:rPr>
+        <w:t xml:space="preserve"> actively </w:t>
+      </w:r>
+      <w:r>
+        <w:rPr>
+          <w:rFonts w:ascii="Garamond" w:hAnsi="Garamond"/>
+          <w:color w:val="000000"/>
+        </w:rPr>
+        <w:t xml:space="preserve">translating </w:t>
+      </w:r>
+      <w:r>
+        <w:rPr>
+          <w:rFonts w:ascii="Garamond" w:hAnsi="Garamond"/>
+          <w:color w:val="000000"/>
+        </w:rPr>
+        <w:t>technical capabilities</w:t>
       </w:r>
       <w:r>
         <w:rPr>
@@ -1064,28 +1271,28 @@
           <w:rFonts w:ascii="Garamond" w:hAnsi="Garamond"/>
           <w:color w:val="000000"/>
         </w:rPr>
-        <w:t>S</w:t>
-      </w:r>
-      <w:r>
-        <w:rPr>
-          <w:rFonts w:ascii="Garamond" w:hAnsi="Garamond"/>
-          <w:color w:val="000000"/>
-        </w:rPr>
-        <w:t>tructur</w:t>
-      </w:r>
-      <w:r>
-        <w:rPr>
-          <w:rFonts w:ascii="Garamond" w:hAnsi="Garamond"/>
-          <w:color w:val="000000"/>
-        </w:rPr>
-        <w:t>ed</w:t>
-      </w:r>
-      <w:r>
-        <w:rPr>
-          <w:rFonts w:ascii="Garamond" w:hAnsi="Garamond"/>
-          <w:color w:val="000000"/>
-        </w:rPr>
-        <w:t xml:space="preserve"> content taxonomy and reusable page templates to improve content governance and streamline publishing workflows across internal teams.</w:t>
+        <w:t>into working demo</w:t>
+      </w:r>
+      <w:r>
+        <w:rPr>
+          <w:rFonts w:ascii="Garamond" w:hAnsi="Garamond"/>
+          <w:color w:val="000000"/>
+        </w:rPr>
+        <w:t>s</w:t>
+      </w:r>
+      <w:r>
+        <w:rPr>
+          <w:rFonts w:ascii="Garamond" w:hAnsi="Garamond"/>
+          <w:color w:val="000000"/>
+        </w:rPr>
+        <w:t>, experimental interfaces and client-facing experiences</w:t>
+      </w:r>
+      <w:r>
+        <w:rPr>
+          <w:rFonts w:ascii="Garamond" w:hAnsi="Garamond"/>
+          <w:color w:val="000000"/>
+        </w:rPr>
+        <w:t>.</w:t>
       </w:r>
     </w:p>
     <w:p>
@@ -1355,16 +1562,7 @@
           <w:bCs/>
           <w:color w:val="000000"/>
         </w:rPr>
-        <w:t>Design</w:t>
-      </w:r>
-      <w:r>
-        <w:rPr>
-          <w:rFonts w:ascii="Garamond" w:hAnsi="Garamond"/>
-          <w:b/>
-          <w:bCs/>
-          <w:color w:val="000000"/>
-        </w:rPr>
-        <w:t>:</w:t>
+        <w:t>Design:</w:t>
       </w:r>
       <w:r>
         <w:rPr>
@@ -1378,7 +1576,14 @@
           <w:rFonts w:ascii="Garamond" w:hAnsi="Garamond"/>
           <w:color w:val="000000"/>
         </w:rPr>
-        <w:t xml:space="preserve">Interaction Design, </w:t>
+        <w:t>Interaction Design</w:t>
+      </w:r>
+      <w:r>
+        <w:rPr>
+          <w:rFonts w:ascii="Garamond" w:hAnsi="Garamond"/>
+          <w:color w:val="000000"/>
+        </w:rPr>
+        <w:t xml:space="preserve">, </w:t>
       </w:r>
       <w:r>
         <w:rPr>
@@ -1389,94 +1594,31 @@
       </w:r>
       <w:r>
         <w:rPr>
-          <w:rFonts w:ascii="Garamond" w:eastAsia="Garamond" w:hAnsi="Garamond" w:cs="Garamond"/>
-          <w:color w:val="000000"/>
-        </w:rPr>
-        <w:t xml:space="preserve">Multimedia Storytelling, </w:t>
-      </w:r>
-      <w:r>
-        <w:rPr>
-          <w:rFonts w:ascii="Garamond" w:eastAsia="Garamond" w:hAnsi="Garamond" w:cs="Garamond"/>
-          <w:color w:val="000000"/>
-        </w:rPr>
-        <w:t>Human-Centred</w:t>
-      </w:r>
-      <w:r>
-        <w:rPr>
-          <w:rFonts w:ascii="Garamond" w:eastAsia="Garamond" w:hAnsi="Garamond" w:cs="Garamond"/>
-          <w:color w:val="000000"/>
-        </w:rPr>
-        <w:t xml:space="preserve"> Design, </w:t>
-      </w:r>
-      <w:r>
-        <w:rPr>
-          <w:rFonts w:ascii="Garamond" w:eastAsia="Garamond" w:hAnsi="Garamond" w:cs="Garamond"/>
-          <w:color w:val="000000"/>
-        </w:rPr>
-        <w:t xml:space="preserve">User Research, </w:t>
-      </w:r>
-      <w:r>
-        <w:rPr>
-          <w:rFonts w:ascii="Garamond" w:eastAsia="Garamond" w:hAnsi="Garamond" w:cs="Garamond"/>
-          <w:color w:val="000000"/>
-        </w:rPr>
-        <w:t xml:space="preserve">User Persona, User Journey, </w:t>
-      </w:r>
-      <w:r>
-        <w:rPr>
-          <w:rFonts w:ascii="Garamond" w:eastAsia="Garamond" w:hAnsi="Garamond" w:cs="Garamond"/>
-          <w:color w:val="000000"/>
-        </w:rPr>
-        <w:t>Responsive Design</w:t>
-      </w:r>
-      <w:r>
-        <w:rPr>
-          <w:rFonts w:ascii="Garamond" w:eastAsia="Garamond" w:hAnsi="Garamond" w:cs="Garamond"/>
-          <w:color w:val="000000"/>
-        </w:rPr>
-        <w:t>,</w:t>
-      </w:r>
-      <w:r>
-        <w:rPr>
-          <w:rFonts w:ascii="Garamond" w:eastAsia="Garamond" w:hAnsi="Garamond" w:cs="Garamond"/>
-          <w:color w:val="000000"/>
-        </w:rPr>
-        <w:t xml:space="preserve"> </w:t>
-      </w:r>
-      <w:r>
-        <w:rPr>
-          <w:rFonts w:ascii="Garamond" w:eastAsia="Garamond" w:hAnsi="Garamond" w:cs="Garamond"/>
-          <w:color w:val="000000"/>
-        </w:rPr>
-        <w:t>Accessibility</w:t>
-      </w:r>
-      <w:r>
-        <w:rPr>
-          <w:rFonts w:ascii="Garamond" w:eastAsia="Garamond" w:hAnsi="Garamond" w:cs="Garamond"/>
+          <w:rFonts w:ascii="Garamond" w:hAnsi="Garamond"/>
+          <w:color w:val="000000"/>
+        </w:rPr>
+        <w:t>Interactive</w:t>
+      </w:r>
+      <w:r>
+        <w:rPr>
+          <w:rFonts w:ascii="Garamond" w:hAnsi="Garamond"/>
+          <w:color w:val="000000"/>
+        </w:rPr>
+        <w:t xml:space="preserve"> Storytelling</w:t>
+      </w:r>
+      <w:r>
+        <w:rPr>
+          <w:rFonts w:ascii="Garamond" w:hAnsi="Garamond"/>
+          <w:color w:val="000000"/>
+        </w:rPr>
+        <w:t>, Responsive Design, Accessibility</w:t>
+      </w:r>
+      <w:r>
+        <w:rPr>
+          <w:rFonts w:ascii="Garamond" w:hAnsi="Garamond"/>
           <w:color w:val="000000"/>
         </w:rPr>
         <w:t xml:space="preserve">, </w:t>
-      </w:r>
-      <w:r>
-        <w:rPr>
-          <w:rFonts w:ascii="Garamond" w:eastAsia="Garamond" w:hAnsi="Garamond" w:cs="Garamond"/>
-          <w:color w:val="000000"/>
-        </w:rPr>
-        <w:t>Storyboarding</w:t>
-      </w:r>
-      <w:r>
-        <w:rPr>
-          <w:rFonts w:ascii="Garamond" w:eastAsia="Garamond" w:hAnsi="Garamond" w:cs="Garamond"/>
-          <w:color w:val="000000"/>
-        </w:rPr>
-        <w:t>,</w:t>
-      </w:r>
-      <w:r>
-        <w:rPr>
-          <w:rFonts w:ascii="Garamond" w:eastAsia="Garamond" w:hAnsi="Garamond" w:cs="Garamond"/>
-          <w:color w:val="000000"/>
-        </w:rPr>
-        <w:t xml:space="preserve"> </w:t>
       </w:r>
       <w:r>
         <w:rPr>
@@ -1503,18 +1645,30 @@
         </w:pBdr>
         <w:spacing w:line="252" w:lineRule="auto"/>
         <w:ind w:left="284" w:hanging="284"/>
-        <w:rPr>
-          <w:color w:val="000000"/>
-        </w:rPr>
-      </w:pPr>
-      <w:r>
-        <w:rPr>
-          <w:rFonts w:ascii="Garamond" w:hAnsi="Garamond"/>
-          <w:b/>
+        <w:jc w:val="distribute"/>
+        <w:rPr>
+          <w:rFonts w:ascii="Garamond" w:hAnsi="Garamond"/>
           <w:bCs/>
           <w:color w:val="000000"/>
         </w:rPr>
-        <w:t>Technical:</w:t>
+      </w:pPr>
+      <w:r>
+        <w:rPr>
+          <w:rFonts w:ascii="Garamond" w:hAnsi="Garamond"/>
+          <w:b/>
+          <w:bCs/>
+          <w:color w:val="000000"/>
+        </w:rPr>
+        <w:t>Creative Tech</w:t>
+      </w:r>
+      <w:r>
+        <w:rPr>
+          <w:rFonts w:ascii="Garamond" w:hAnsi="Garamond"/>
+          <w:b/>
+          <w:bCs/>
+          <w:color w:val="000000"/>
+        </w:rPr>
+        <w:t>:</w:t>
       </w:r>
       <w:r>
         <w:rPr>
@@ -1528,7 +1682,7 @@
           <w:bCs/>
           <w:color w:val="000000"/>
         </w:rPr>
-        <w:t>JavaScript, Python</w:t>
+        <w:t xml:space="preserve">Creative Coding, Real-Time Graphics, </w:t>
       </w:r>
       <w:r>
         <w:rPr>
@@ -1536,7 +1690,7 @@
           <w:bCs/>
           <w:color w:val="000000"/>
         </w:rPr>
-        <w:t xml:space="preserve">, </w:t>
+        <w:t xml:space="preserve">Spatial Interaction, </w:t>
       </w:r>
       <w:r>
         <w:rPr>
@@ -1544,71 +1698,16 @@
           <w:bCs/>
           <w:color w:val="000000"/>
         </w:rPr>
-        <w:t>HTML5, CSS3,</w:t>
-      </w:r>
-      <w:r>
-        <w:rPr>
-          <w:rFonts w:ascii="Garamond" w:eastAsia="Garamond" w:hAnsi="Garamond" w:cs="Garamond"/>
+        <w:t>XR, Sensor Systems, Data Visualisation</w:t>
+      </w:r>
+      <w:r>
+        <w:rPr>
+          <w:rFonts w:ascii="Garamond" w:eastAsia="Garamond" w:hAnsi="Garamond" w:cs="Garamond"/>
+          <w:b/>
           <w:bCs/>
           <w:color w:val="000000"/>
         </w:rPr>
         <w:t xml:space="preserve"> </w:t>
-      </w:r>
-      <w:r>
-        <w:rPr>
-          <w:rFonts w:ascii="Garamond" w:eastAsia="Garamond" w:hAnsi="Garamond" w:cs="Garamond"/>
-          <w:bCs/>
-          <w:color w:val="000000"/>
-        </w:rPr>
-        <w:t>Git,</w:t>
-      </w:r>
-      <w:r>
-        <w:rPr>
-          <w:rFonts w:ascii="Garamond" w:eastAsia="Garamond" w:hAnsi="Garamond" w:cs="Garamond"/>
-          <w:bCs/>
-          <w:color w:val="000000"/>
-        </w:rPr>
-        <w:t xml:space="preserve"> </w:t>
-      </w:r>
-      <w:r>
-        <w:rPr>
-          <w:rFonts w:ascii="Garamond" w:eastAsia="Garamond" w:hAnsi="Garamond" w:cs="Garamond"/>
-          <w:bCs/>
-          <w:color w:val="000000"/>
-        </w:rPr>
-        <w:t>CMS platforms, API Integration</w:t>
-      </w:r>
-      <w:r>
-        <w:rPr>
-          <w:rFonts w:ascii="Garamond" w:eastAsia="Garamond" w:hAnsi="Garamond" w:cs="Garamond"/>
-          <w:bCs/>
-          <w:color w:val="000000"/>
-        </w:rPr>
-        <w:t xml:space="preserve">, </w:t>
-      </w:r>
-      <w:r>
-        <w:rPr>
-          <w:rFonts w:ascii="Garamond" w:eastAsia="Garamond" w:hAnsi="Garamond" w:cs="Garamond"/>
-          <w:bCs/>
-          <w:color w:val="000000"/>
-        </w:rPr>
-        <w:t>Sensors</w:t>
-      </w:r>
-      <w:r>
-        <w:rPr>
-          <w:rFonts w:ascii="Garamond" w:eastAsia="Garamond" w:hAnsi="Garamond" w:cs="Garamond"/>
-          <w:bCs/>
-          <w:color w:val="000000"/>
-        </w:rPr>
-        <w:t xml:space="preserve"> </w:t>
-      </w:r>
-      <w:r>
-        <w:rPr>
-          <w:rFonts w:ascii="Garamond" w:eastAsia="Garamond" w:hAnsi="Garamond" w:cs="Garamond"/>
-          <w:bCs/>
-          <w:color w:val="000000"/>
-        </w:rPr>
-        <w:t>Systems</w:t>
       </w:r>
     </w:p>
     <w:p>
@@ -1628,37 +1727,44 @@
         <w:spacing w:line="252" w:lineRule="auto"/>
         <w:ind w:left="284" w:hanging="284"/>
         <w:rPr>
-          <w:color w:val="000000"/>
-        </w:rPr>
-      </w:pPr>
-      <w:r>
-        <w:rPr>
-          <w:rFonts w:ascii="Garamond" w:eastAsia="Garamond" w:hAnsi="Garamond" w:cs="Garamond"/>
-          <w:b/>
-        </w:rPr>
-        <w:t>Creative</w:t>
-      </w:r>
-      <w:r>
-        <w:rPr>
-          <w:rFonts w:ascii="Garamond" w:eastAsia="Garamond" w:hAnsi="Garamond" w:cs="Garamond"/>
-          <w:b/>
-        </w:rPr>
-        <w:t xml:space="preserve">: </w:t>
-      </w:r>
-      <w:r>
-        <w:rPr>
-          <w:rFonts w:ascii="Garamond" w:eastAsia="Garamond" w:hAnsi="Garamond" w:cs="Garamond"/>
+          <w:rFonts w:ascii="Garamond" w:hAnsi="Garamond"/>
           <w:bCs/>
-        </w:rPr>
-        <w:t xml:space="preserve">Figma, Adobe Suite (Photoshop, Illustrator), </w:t>
-      </w:r>
-      <w:r>
-        <w:rPr>
-          <w:rFonts w:ascii="Garamond" w:hAnsi="Garamond"/>
-          <w:color w:val="000000"/>
-        </w:rPr>
-        <w:t>Blender</w:t>
-      </w:r>
+          <w:color w:val="000000"/>
+        </w:rPr>
+      </w:pPr>
+      <w:r>
+        <w:rPr>
+          <w:rFonts w:ascii="Garamond" w:hAnsi="Garamond"/>
+          <w:b/>
+          <w:color w:val="000000"/>
+        </w:rPr>
+        <w:t>Technical</w:t>
+      </w:r>
+      <w:r>
+        <w:rPr>
+          <w:rFonts w:ascii="Garamond" w:hAnsi="Garamond"/>
+          <w:b/>
+          <w:color w:val="000000"/>
+        </w:rPr>
+        <w:t xml:space="preserve"> &amp; AI:</w:t>
+      </w:r>
+      <w:r>
+        <w:rPr>
+          <w:rFonts w:ascii="Garamond" w:hAnsi="Garamond"/>
+          <w:bCs/>
+          <w:color w:val="000000"/>
+        </w:rPr>
+        <w:t xml:space="preserve"> JavaScript, Python, Node.js, HTML/CSS, WebGL, </w:t>
+      </w:r>
+      <w:proofErr w:type="spellStart"/>
+      <w:r>
+        <w:rPr>
+          <w:rFonts w:ascii="Garamond" w:hAnsi="Garamond"/>
+          <w:color w:val="000000"/>
+        </w:rPr>
+        <w:t>RealityKit</w:t>
+      </w:r>
+      <w:proofErr w:type="spellEnd"/>
       <w:r>
         <w:rPr>
           <w:rFonts w:ascii="Garamond" w:hAnsi="Garamond"/>
@@ -1668,54 +1774,11 @@
       </w:r>
       <w:r>
         <w:rPr>
-          <w:rFonts w:ascii="Garamond" w:eastAsia="Garamond" w:hAnsi="Garamond" w:cs="Garamond"/>
+          <w:rFonts w:ascii="Garamond" w:hAnsi="Garamond"/>
           <w:bCs/>
-        </w:rPr>
-        <w:t xml:space="preserve">Rhino, </w:t>
-      </w:r>
-      <w:proofErr w:type="spellStart"/>
-      <w:r>
-        <w:rPr>
-          <w:rFonts w:ascii="Garamond" w:eastAsia="Garamond" w:hAnsi="Garamond" w:cs="Garamond"/>
-          <w:bCs/>
-        </w:rPr>
-        <w:t>Touch</w:t>
-      </w:r>
-      <w:r>
-        <w:rPr>
-          <w:rFonts w:ascii="Garamond" w:eastAsia="Garamond" w:hAnsi="Garamond" w:cs="Garamond"/>
-          <w:bCs/>
-        </w:rPr>
-        <w:t>D</w:t>
-      </w:r>
-      <w:r>
-        <w:rPr>
-          <w:rFonts w:ascii="Garamond" w:eastAsia="Garamond" w:hAnsi="Garamond" w:cs="Garamond"/>
-          <w:bCs/>
-        </w:rPr>
-        <w:t>esigner</w:t>
-      </w:r>
-      <w:proofErr w:type="spellEnd"/>
-      <w:r>
-        <w:rPr>
-          <w:rFonts w:ascii="Garamond" w:eastAsia="Garamond" w:hAnsi="Garamond" w:cs="Garamond"/>
-          <w:bCs/>
-        </w:rPr>
-        <w:t xml:space="preserve">, </w:t>
-      </w:r>
-      <w:r>
-        <w:rPr>
-          <w:rFonts w:ascii="Garamond" w:hAnsi="Garamond"/>
-          <w:color w:val="000000"/>
-        </w:rPr>
-        <w:t>VR/AR/X</w:t>
-      </w:r>
-      <w:r>
-        <w:rPr>
-          <w:rFonts w:ascii="Garamond" w:hAnsi="Garamond"/>
-          <w:color w:val="000000"/>
-        </w:rPr>
-        <w:t>R</w:t>
+          <w:color w:val="000000"/>
+        </w:rPr>
+        <w:t>API Integration, Generative AI</w:t>
       </w:r>
     </w:p>
     <w:p>
@@ -1745,33 +1808,65 @@
           <w:b/>
           <w:bCs/>
         </w:rPr>
-        <w:t>Brand</w:t>
-      </w:r>
-      <w:r>
-        <w:rPr>
-          <w:rFonts w:ascii="Garamond" w:hAnsi="Garamond"/>
-          <w:b/>
-          <w:bCs/>
-        </w:rPr>
-        <w:t>:</w:t>
-      </w:r>
-      <w:r>
-        <w:rPr>
-          <w:rFonts w:ascii="Garamond" w:hAnsi="Garamond"/>
-        </w:rPr>
-        <w:t xml:space="preserve"> </w:t>
-      </w:r>
-      <w:r>
-        <w:rPr>
-          <w:rFonts w:ascii="Garamond" w:hAnsi="Garamond"/>
-        </w:rPr>
-        <w:t xml:space="preserve">Brand Communication, </w:t>
-      </w:r>
-      <w:r>
-        <w:rPr>
-          <w:rFonts w:ascii="Garamond" w:hAnsi="Garamond"/>
-        </w:rPr>
-        <w:t>Stakeholder Communication, Brief Interpretation, Feedback &amp; Iteration</w:t>
+        <w:t xml:space="preserve">Tools: </w:t>
+      </w:r>
+      <w:r>
+        <w:rPr>
+          <w:rFonts w:ascii="Garamond" w:hAnsi="Garamond"/>
+          <w:color w:val="000000"/>
+        </w:rPr>
+        <w:t xml:space="preserve">Figma, Adobe Creative Suite, </w:t>
+      </w:r>
+      <w:proofErr w:type="spellStart"/>
+      <w:r>
+        <w:rPr>
+          <w:rFonts w:ascii="Garamond" w:hAnsi="Garamond"/>
+          <w:color w:val="000000"/>
+        </w:rPr>
+        <w:t>TouchDesigner</w:t>
+      </w:r>
+      <w:proofErr w:type="spellEnd"/>
+      <w:r>
+        <w:rPr>
+          <w:rFonts w:ascii="Garamond" w:hAnsi="Garamond"/>
+          <w:color w:val="000000"/>
+        </w:rPr>
+        <w:t xml:space="preserve">, </w:t>
+      </w:r>
+      <w:r>
+        <w:rPr>
+          <w:rFonts w:ascii="Garamond" w:hAnsi="Garamond"/>
+          <w:color w:val="000000"/>
+        </w:rPr>
+        <w:t xml:space="preserve">Blender, </w:t>
+      </w:r>
+      <w:r>
+        <w:rPr>
+          <w:rFonts w:ascii="Garamond" w:hAnsi="Garamond"/>
+          <w:color w:val="000000"/>
+        </w:rPr>
+        <w:t xml:space="preserve">Digital Fabrication, </w:t>
+      </w:r>
+      <w:r>
+        <w:rPr>
+          <w:rFonts w:ascii="Garamond" w:hAnsi="Garamond"/>
+          <w:color w:val="000000"/>
+        </w:rPr>
+        <w:t>Git/GitHub</w:t>
+      </w:r>
+      <w:r>
+        <w:rPr>
+          <w:rFonts w:ascii="Garamond" w:hAnsi="Garamond"/>
+          <w:color w:val="000000"/>
+        </w:rPr>
+        <w:t xml:space="preserve">, </w:t>
+      </w:r>
+      <w:r>
+        <w:rPr>
+          <w:rFonts w:ascii="Garamond" w:hAnsi="Garamond"/>
+          <w:color w:val="000000"/>
+        </w:rPr>
+        <w:t>CMS Platforms</w:t>
       </w:r>
     </w:p>
     <w:sectPr>

</xml_diff>